<commit_message>
Actualizar el documento del Sprint 4 con las observaciones de la revision
</commit_message>
<xml_diff>
--- a/Documentos/AEUVG - Desarrollo Sprint 4.docx
+++ b/Documentos/AEUVG - Desarrollo Sprint 4.docx
@@ -1175,7 +1175,7 @@
           <w:sz w:val="24"/>
           <w:szCs w:val="24"/>
         </w:rPr>
-        <w:t xml:space="preserve">Las pruebas automatizadas del proyecto pasaron de 225 a 312. Las 87 nuevas corresponden a este sprint y se ejecutan sin base de datos, sustituyendo el acceso a datos por dobles de prueba, para que puedan correrse en cualquier momento del desarrollo.</w:t>
+        <w:t xml:space="preserve">Las pruebas automatizadas del proyecto pasaron de 225 a 319. Las 94 nuevas corresponden a este sprint y se ejecutan sin base de datos, sustituyendo el acceso a datos por dobles de prueba, para que puedan correrse en cualquier momento del desarrollo.</w:t>
       </w:r>
     </w:p>
     <w:p>
@@ -1335,7 +1335,7 @@
                 <w:sz w:val="24"/>
                 <w:szCs w:val="24"/>
               </w:rPr>
-              <w:t xml:space="preserve">22</w:t>
+              <w:t xml:space="preserve">26</w:t>
             </w:r>
           </w:p>
         </w:tc>
@@ -1415,7 +1415,7 @@
                 <w:sz w:val="24"/>
                 <w:szCs w:val="24"/>
               </w:rPr>
-              <w:t xml:space="preserve">14</w:t>
+              <w:t xml:space="preserve">17</w:t>
             </w:r>
           </w:p>
         </w:tc>
@@ -1441,7 +1441,7 @@
                 <w:sz w:val="24"/>
                 <w:szCs w:val="24"/>
               </w:rPr>
-              <w:t xml:space="preserve">Que un parámetro inválido se descarte, el rango invertido, el filtro de vínculo y que las fechas se comparen como día de calendario en UTC.</w:t>
+              <w:t xml:space="preserve">Que un parámetro inválido se descarte, el rango invertido, el filtro de vínculo, que las fechas se comparen como día de calendario en UTC y que el destino de regreso sea una ruta interna de la sección.</w:t>
             </w:r>
           </w:p>
         </w:tc>
@@ -1957,6 +1957,20 @@
           <w:szCs w:val="24"/>
         </w:rPr>
         <w:t xml:space="preserve">Queda pendiente aplicar la migración del sprint en el ambiente de pruebas de Railway, por la razón explicada en la sección 8, y la carga de los registros históricos que AEUVG administra hoy en sus hojas, que corresponde al Sprint 5 junto con la importación desde Excel. Continúa también en gestión el trámite del dominio institucional iniciado en el Sprint 1.</w:t>
+      </w:r>
+    </w:p>
+    <w:p>
+      <w:pPr>
+        <w:spacing w:after="160" w:line="300"/>
+        <w:jc w:val="both"/>
+      </w:pPr>
+      <w:r>
+        <w:rPr>
+          <w:rFonts w:ascii="Times New Roman" w:cs="Times New Roman" w:eastAsia="Times New Roman" w:hAnsi="Times New Roman"/>
+          <w:sz w:val="24"/>
+          <w:szCs w:val="24"/>
+        </w:rPr>
+        <w:t xml:space="preserve">Tras la revisión del sprint se incorporaron las observaciones recibidas, sin alcance nuevo: el registro rechaza una fecha de actividad posterior a hoy, que solo puede ser un error de captura y dejaba el registro fuera del periodo que se estuviera cerrando; el panel presenta quién acreditó cada registro y cuándo, dato que la tabla ya guardaba pero no mostraba y que con varios administradores era el único modo de rastrear una acreditación aplicada por error; el formulario vuelve al listado con los filtros que traía, porque guardar obligaba a escribir otra vez el periodo que se estaba revisando; y el historial del perfil indica desde cuándo está acreditada cada actividad, ya que saber que lo está no le servía al estudiante para reclamar lo que falta.</w:t>
       </w:r>
     </w:p>
     <w:p>

</xml_diff>

<commit_message>
Actualizar el registro de tiempos del Sprint 4 con el cierre completo
</commit_message>
<xml_diff>
--- a/Documentos/AEUVG - Desarrollo Sprint 4.docx
+++ b/Documentos/AEUVG - Desarrollo Sprint 4.docx
@@ -5118,7 +5118,7 @@
                 <w:sz w:val="24"/>
                 <w:szCs w:val="24"/>
               </w:rPr>
-              <w:t xml:space="preserve">23:35</w:t>
+              <w:t xml:space="preserve">23:30</w:t>
             </w:r>
           </w:p>
         </w:tc>
@@ -5170,7 +5170,7 @@
                 <w:sz w:val="24"/>
                 <w:szCs w:val="24"/>
               </w:rPr>
-              <w:t xml:space="preserve">0:50</w:t>
+              <w:t xml:space="preserve">0:45</w:t>
             </w:r>
           </w:p>
         </w:tc>
@@ -5486,7 +5486,7 @@
                 <w:sz w:val="24"/>
                 <w:szCs w:val="24"/>
               </w:rPr>
-              <w:t xml:space="preserve">16:55</w:t>
+              <w:t xml:space="preserve">17:00</w:t>
             </w:r>
           </w:p>
         </w:tc>
@@ -5538,7 +5538,7 @@
                 <w:sz w:val="24"/>
                 <w:szCs w:val="24"/>
               </w:rPr>
-              <w:t xml:space="preserve">1:10</w:t>
+              <w:t xml:space="preserve">1:15</w:t>
             </w:r>
           </w:p>
         </w:tc>
@@ -5590,7 +5590,7 @@
                 <w:sz w:val="24"/>
                 <w:szCs w:val="24"/>
               </w:rPr>
-              <w:t xml:space="preserve">AEUVG-176 Fecha de actividad futura rechazada al registrar. AEUVG-178 Filtros del panel conservados al volver de guardar. Integración de los ajustes a main.</w:t>
+              <w:t xml:space="preserve">AEUVG-176 Fecha de actividad futura rechazada al registrar. AEUVG-178 Filtros del panel conservados al volver de guardar. Actualización del documento e integración de los ajustes a main.</w:t>
             </w:r>
           </w:p>
         </w:tc>
@@ -5774,7 +5774,7 @@
                 <w:sz w:val="24"/>
                 <w:szCs w:val="24"/>
               </w:rPr>
-              <w:t xml:space="preserve">Actualización del registro de tiempos con el cierre completo y publicación de la versión final del sprint.</w:t>
+              <w:t xml:space="preserve">Actualización del registro de tiempos con el cierre completo, verificación de la migración pendiente y publicación de la versión final del sprint.</w:t>
             </w:r>
           </w:p>
         </w:tc>
@@ -6516,7 +6516,7 @@
                 <w:sz w:val="24"/>
                 <w:szCs w:val="24"/>
               </w:rPr>
-              <w:t xml:space="preserve">2:30</w:t>
+              <w:t xml:space="preserve">2:35</w:t>
             </w:r>
           </w:p>
         </w:tc>
@@ -6542,7 +6542,7 @@
                 <w:sz w:val="24"/>
                 <w:szCs w:val="24"/>
               </w:rPr>
-              <w:t xml:space="preserve">2.5</w:t>
+              <w:t xml:space="preserve">2.6</w:t>
             </w:r>
           </w:p>
         </w:tc>
@@ -6596,7 +6596,7 @@
                 <w:sz w:val="24"/>
                 <w:szCs w:val="24"/>
               </w:rPr>
-              <w:t xml:space="preserve">2:40</w:t>
+              <w:t xml:space="preserve">2:35</w:t>
             </w:r>
           </w:p>
         </w:tc>
@@ -6622,7 +6622,7 @@
                 <w:sz w:val="24"/>
                 <w:szCs w:val="24"/>
               </w:rPr>
-              <w:t xml:space="preserve">2.7</w:t>
+              <w:t xml:space="preserve">2.6</w:t>
             </w:r>
           </w:p>
         </w:tc>

</xml_diff>

<commit_message>
Registrar en el documento del Sprint 4 la integracion de los ajustes del Sprint 3
</commit_message>
<xml_diff>
--- a/Documentos/AEUVG - Desarrollo Sprint 4.docx
+++ b/Documentos/AEUVG - Desarrollo Sprint 4.docx
@@ -1175,7 +1175,7 @@
           <w:sz w:val="24"/>
           <w:szCs w:val="24"/>
         </w:rPr>
-        <w:t xml:space="preserve">Las pruebas automatizadas del proyecto pasaron de 225 a 319. Las 94 nuevas corresponden a este sprint y se ejecutan sin base de datos, sustituyendo el acceso a datos por dobles de prueba, para que puedan correrse en cualquier momento del desarrollo.</w:t>
+        <w:t xml:space="preserve">Las pruebas automatizadas del proyecto pasaron de 236 a 330. Las 94 nuevas corresponden a este sprint y se ejecutan sin base de datos, sustituyendo el acceso a datos por dobles de prueba, para que puedan correrse en cualquier momento del desarrollo.</w:t>
       </w:r>
     </w:p>
     <w:p>
@@ -1797,6 +1797,20 @@
           <w:sz w:val="24"/>
           <w:szCs w:val="24"/>
         </w:rPr>
+        <w:t xml:space="preserve">Los ajustes finales del Sprint 3 —el asterisco de los campos obligatorios, las siglas de las asociaciones, las tarjetas de asociaciones y clubes, la portada con su carrusel y el contenido de demostración— se publicaron en la rama principal mientras este sprint estaba en curso, así que su integración se verificó al cierre. La fusión no produjo conflictos: los dos incrementos coinciden únicamente en el esquema de datos, en los datos de prueba y en la documentación del modelo, y en los tres casos agregan partes distintas. La migración de las siglas, del 8 de octubre, se aplica antes que la de este sprint, del 9. Con los dos incrementos juntos, las 330 pruebas se ejecutan sin fallos y la compilación de producción se completa.</w:t>
+      </w:r>
+    </w:p>
+    <w:p>
+      <w:pPr>
+        <w:spacing w:after="160" w:line="300"/>
+        <w:jc w:val="both"/>
+      </w:pPr>
+      <w:r>
+        <w:rPr>
+          <w:rFonts w:ascii="Times New Roman" w:cs="Times New Roman" w:eastAsia="Times New Roman" w:hAnsi="Times New Roman"/>
+          <w:sz w:val="24"/>
+          <w:szCs w:val="24"/>
+        </w:rPr>
         <w:t xml:space="preserve">La migración del sprint quedó lista para aplicarse en el ambiente de pruebas de Railway con el procedimiento por túnel cifrado del Sprint 2. Al cierre de este documento la aplicación quedó pendiente, porque la sesión del CLI de Railway caducó y su renovación requiere iniciar sesión desde el navegador. No afecta al incremento ya construido: la migración no modifica ninguna columna existente, agrega tres y relaja la obligatoriedad del vínculo con el estudiante, y su carga inicial recalcula el carnet, el nombre y el texto de búsqueda de los registros que ya estaban cargados.</w:t>
       </w:r>
     </w:p>
@@ -1828,7 +1842,7 @@
           <w:sz w:val="24"/>
           <w:szCs w:val="24"/>
         </w:rPr>
-        <w:t xml:space="preserve">Las seis historias comprometidas para el Sprint 4 se encuentran completadas, con 29.5 horas de trabajo de equipo frente a las 30 estimadas. El detalle por sesión se encuentra en la sección 10. La plataforma cuenta ahora con:</w:t>
+        <w:t xml:space="preserve">Las seis historias comprometidas para el Sprint 4 se encuentran completadas, con 30.3 horas de trabajo de equipo frente a las 30 estimadas. El detalle por sesión se encuentra en la sección 10. La plataforma cuenta ahora con:</w:t>
       </w:r>
     </w:p>
     <w:p>
@@ -2043,7 +2057,7 @@
           <w:sz w:val="24"/>
           <w:szCs w:val="24"/>
         </w:rPr>
-        <w:t xml:space="preserve">El sprint sumó 29.5 horas de equipo: 17.0 horas de Harry Méndez y 12.5 horas de Juan Gabriel Gualim, frente a las 30 horas estimadas en la planificación, es decir, un 2% por debajo de lo previsto. La estimación se calculó con la velocidad medida en el Sprint 3 y resultó acertada: el módulo no reutilizó pantallas ya resueltas, pero sí la protección por rol, la paginación, la validación de parámetros y la búsqueda sin acentos de los sprints anteriores.</w:t>
+        <w:t xml:space="preserve">El sprint sumó 30.3 horas de equipo: 17.8 horas de Harry Méndez y 12.5 horas de Juan Gabriel Gualim, frente a las 30 horas estimadas en la planificación, es decir, un 1% por encima de lo previsto. La estimación se calculó con las 30.4 horas que consumieron las historias comprometidas del Sprint 3 y resultó acertada: el módulo no reutilizó pantallas ya resueltas, pero sí la protección por rol, la paginación, la validación de parámetros y la búsqueda sin acentos de los sprints anteriores. La última sesión corresponde a la integración de los ajustes finales del Sprint 3, que se publicaron en la rama principal mientras este sprint estaba en curso.</w:t>
       </w:r>
     </w:p>
     <w:p>
@@ -5779,6 +5793,190 @@
           </w:p>
         </w:tc>
       </w:tr>
+      <w:tr>
+        <w:tc>
+          <w:tcPr>
+            <w:tcW w:type="dxa" w:w="900"/>
+            <w:tcMar>
+              <w:top w:type="dxa" w:w="80"/>
+              <w:left w:type="dxa" w:w="120"/>
+              <w:bottom w:type="dxa" w:w="80"/>
+              <w:right w:type="dxa" w:w="120"/>
+            </w:tcMar>
+          </w:tcPr>
+          <w:p>
+            <w:pPr>
+              <w:spacing w:after="0"/>
+            </w:pPr>
+            <w:r>
+              <w:rPr>
+                <w:rFonts w:ascii="Times New Roman" w:cs="Times New Roman" w:eastAsia="Times New Roman" w:hAnsi="Times New Roman"/>
+                <w:b w:val="false"/>
+                <w:bCs w:val="false"/>
+                <w:sz w:val="24"/>
+                <w:szCs w:val="24"/>
+              </w:rPr>
+              <w:t xml:space="preserve">22/10/2026</w:t>
+            </w:r>
+          </w:p>
+        </w:tc>
+        <w:tc>
+          <w:tcPr>
+            <w:tcW w:type="dxa" w:w="680"/>
+            <w:tcMar>
+              <w:top w:type="dxa" w:w="80"/>
+              <w:left w:type="dxa" w:w="120"/>
+              <w:bottom w:type="dxa" w:w="80"/>
+              <w:right w:type="dxa" w:w="120"/>
+            </w:tcMar>
+          </w:tcPr>
+          <w:p>
+            <w:pPr>
+              <w:spacing w:after="0"/>
+            </w:pPr>
+            <w:r>
+              <w:rPr>
+                <w:rFonts w:ascii="Times New Roman" w:cs="Times New Roman" w:eastAsia="Times New Roman" w:hAnsi="Times New Roman"/>
+                <w:b w:val="false"/>
+                <w:bCs w:val="false"/>
+                <w:sz w:val="24"/>
+                <w:szCs w:val="24"/>
+              </w:rPr>
+              <w:t xml:space="preserve">19:10</w:t>
+            </w:r>
+          </w:p>
+        </w:tc>
+        <w:tc>
+          <w:tcPr>
+            <w:tcW w:type="dxa" w:w="680"/>
+            <w:tcMar>
+              <w:top w:type="dxa" w:w="80"/>
+              <w:left w:type="dxa" w:w="120"/>
+              <w:bottom w:type="dxa" w:w="80"/>
+              <w:right w:type="dxa" w:w="120"/>
+            </w:tcMar>
+          </w:tcPr>
+          <w:p>
+            <w:pPr>
+              <w:spacing w:after="0"/>
+            </w:pPr>
+            <w:r>
+              <w:rPr>
+                <w:rFonts w:ascii="Times New Roman" w:cs="Times New Roman" w:eastAsia="Times New Roman" w:hAnsi="Times New Roman"/>
+                <w:b w:val="false"/>
+                <w:bCs w:val="false"/>
+                <w:sz w:val="24"/>
+                <w:szCs w:val="24"/>
+              </w:rPr>
+              <w:t xml:space="preserve">20:05</w:t>
+            </w:r>
+          </w:p>
+        </w:tc>
+        <w:tc>
+          <w:tcPr>
+            <w:tcW w:type="dxa" w:w="1120"/>
+            <w:tcMar>
+              <w:top w:type="dxa" w:w="80"/>
+              <w:left w:type="dxa" w:w="120"/>
+              <w:bottom w:type="dxa" w:w="80"/>
+              <w:right w:type="dxa" w:w="120"/>
+            </w:tcMar>
+          </w:tcPr>
+          <w:p>
+            <w:pPr>
+              <w:spacing w:after="0"/>
+            </w:pPr>
+            <w:r>
+              <w:rPr>
+                <w:rFonts w:ascii="Times New Roman" w:cs="Times New Roman" w:eastAsia="Times New Roman" w:hAnsi="Times New Roman"/>
+                <w:b w:val="false"/>
+                <w:bCs w:val="false"/>
+                <w:sz w:val="24"/>
+                <w:szCs w:val="24"/>
+              </w:rPr>
+              <w:t xml:space="preserve">0:05</w:t>
+            </w:r>
+          </w:p>
+        </w:tc>
+        <w:tc>
+          <w:tcPr>
+            <w:tcW w:type="dxa" w:w="900"/>
+            <w:tcMar>
+              <w:top w:type="dxa" w:w="80"/>
+              <w:left w:type="dxa" w:w="120"/>
+              <w:bottom w:type="dxa" w:w="80"/>
+              <w:right w:type="dxa" w:w="120"/>
+            </w:tcMar>
+          </w:tcPr>
+          <w:p>
+            <w:pPr>
+              <w:spacing w:after="0"/>
+            </w:pPr>
+            <w:r>
+              <w:rPr>
+                <w:rFonts w:ascii="Times New Roman" w:cs="Times New Roman" w:eastAsia="Times New Roman" w:hAnsi="Times New Roman"/>
+                <w:b w:val="false"/>
+                <w:bCs w:val="false"/>
+                <w:sz w:val="24"/>
+                <w:szCs w:val="24"/>
+              </w:rPr>
+              <w:t xml:space="preserve">0:50</w:t>
+            </w:r>
+          </w:p>
+        </w:tc>
+        <w:tc>
+          <w:tcPr>
+            <w:tcW w:type="dxa" w:w="1280"/>
+            <w:tcMar>
+              <w:top w:type="dxa" w:w="80"/>
+              <w:left w:type="dxa" w:w="120"/>
+              <w:bottom w:type="dxa" w:w="80"/>
+              <w:right w:type="dxa" w:w="120"/>
+            </w:tcMar>
+          </w:tcPr>
+          <w:p>
+            <w:pPr>
+              <w:spacing w:after="0"/>
+            </w:pPr>
+            <w:r>
+              <w:rPr>
+                <w:rFonts w:ascii="Times New Roman" w:cs="Times New Roman" w:eastAsia="Times New Roman" w:hAnsi="Times New Roman"/>
+                <w:b w:val="false"/>
+                <w:bCs w:val="false"/>
+                <w:sz w:val="24"/>
+                <w:szCs w:val="24"/>
+              </w:rPr>
+              <w:t xml:space="preserve">Integración</w:t>
+            </w:r>
+          </w:p>
+        </w:tc>
+        <w:tc>
+          <w:tcPr>
+            <w:tcW w:type="dxa" w:w="3800"/>
+            <w:tcMar>
+              <w:top w:type="dxa" w:w="80"/>
+              <w:left w:type="dxa" w:w="120"/>
+              <w:bottom w:type="dxa" w:w="80"/>
+              <w:right w:type="dxa" w:w="120"/>
+            </w:tcMar>
+          </w:tcPr>
+          <w:p>
+            <w:pPr>
+              <w:spacing w:after="0"/>
+            </w:pPr>
+            <w:r>
+              <w:rPr>
+                <w:rFonts w:ascii="Times New Roman" w:cs="Times New Roman" w:eastAsia="Times New Roman" w:hAnsi="Times New Roman"/>
+                <w:b w:val="false"/>
+                <w:bCs w:val="false"/>
+                <w:sz w:val="24"/>
+                <w:szCs w:val="24"/>
+              </w:rPr>
+              <w:t xml:space="preserve">Integración de los ajustes finales del Sprint 3 publicados en main, verificación conjunta de los dos incrementos y corrección de la planificación.</w:t>
+            </w:r>
+          </w:p>
+        </w:tc>
+      </w:tr>
     </w:tbl>
     <w:p>
       <w:pPr>
@@ -6062,7 +6260,7 @@
                 <w:sz w:val="24"/>
                 <w:szCs w:val="24"/>
               </w:rPr>
-              <w:t xml:space="preserve">2.7</w:t>
+              <w:t xml:space="preserve">2.8</w:t>
             </w:r>
           </w:p>
         </w:tc>
@@ -6516,7 +6714,7 @@
                 <w:sz w:val="24"/>
                 <w:szCs w:val="24"/>
               </w:rPr>
-              <w:t xml:space="preserve">2:35</w:t>
+              <w:t xml:space="preserve">3:25</w:t>
             </w:r>
           </w:p>
         </w:tc>
@@ -6542,7 +6740,7 @@
                 <w:sz w:val="24"/>
                 <w:szCs w:val="24"/>
               </w:rPr>
-              <w:t xml:space="preserve">2.6</w:t>
+              <w:t xml:space="preserve">3.3</w:t>
             </w:r>
           </w:p>
         </w:tc>
@@ -6676,7 +6874,7 @@
                 <w:sz w:val="24"/>
                 <w:szCs w:val="24"/>
               </w:rPr>
-              <w:t xml:space="preserve">17:00</w:t>
+              <w:t xml:space="preserve">17:50</w:t>
             </w:r>
           </w:p>
         </w:tc>
@@ -6702,7 +6900,7 @@
                 <w:sz w:val="24"/>
                 <w:szCs w:val="24"/>
               </w:rPr>
-              <w:t xml:space="preserve">17.0</w:t>
+              <w:t xml:space="preserve">17.8</w:t>
             </w:r>
           </w:p>
         </w:tc>
@@ -10756,7 +10954,7 @@
                 <w:sz w:val="24"/>
                 <w:szCs w:val="24"/>
               </w:rPr>
-              <w:t xml:space="preserve">19</w:t>
+              <w:t xml:space="preserve">20</w:t>
             </w:r>
           </w:p>
         </w:tc>
@@ -10782,7 +10980,7 @@
                 <w:sz w:val="24"/>
                 <w:szCs w:val="24"/>
               </w:rPr>
-              <w:t xml:space="preserve">17:00</w:t>
+              <w:t xml:space="preserve">17:50</w:t>
             </w:r>
           </w:p>
         </w:tc>
@@ -10808,7 +11006,7 @@
                 <w:sz w:val="24"/>
                 <w:szCs w:val="24"/>
               </w:rPr>
-              <w:t xml:space="preserve">17.0</w:t>
+              <w:t xml:space="preserve">17.8</w:t>
             </w:r>
           </w:p>
         </w:tc>
@@ -10968,7 +11166,7 @@
                 <w:sz w:val="24"/>
                 <w:szCs w:val="24"/>
               </w:rPr>
-              <w:t xml:space="preserve">34</w:t>
+              <w:t xml:space="preserve">35</w:t>
             </w:r>
           </w:p>
         </w:tc>
@@ -10994,7 +11192,7 @@
                 <w:sz w:val="24"/>
                 <w:szCs w:val="24"/>
               </w:rPr>
-              <w:t xml:space="preserve">29:30</w:t>
+              <w:t xml:space="preserve">30:20</w:t>
             </w:r>
           </w:p>
         </w:tc>
@@ -11020,7 +11218,7 @@
                 <w:sz w:val="24"/>
                 <w:szCs w:val="24"/>
               </w:rPr>
-              <w:t xml:space="preserve">29.5</w:t>
+              <w:t xml:space="preserve">30.3</w:t>
             </w:r>
           </w:p>
         </w:tc>

</xml_diff>

<commit_message>
corregir el estado de la migracion en el documento del Sprint 4
</commit_message>
<xml_diff>
--- a/Documentos/AEUVG - Desarrollo Sprint 4.docx
+++ b/Documentos/AEUVG - Desarrollo Sprint 4.docx
@@ -1811,7 +1811,7 @@
           <w:sz w:val="24"/>
           <w:szCs w:val="24"/>
         </w:rPr>
-        <w:t xml:space="preserve">La migración del sprint quedó lista para aplicarse en el ambiente de pruebas de Railway con el procedimiento por túnel cifrado del Sprint 2. Al cierre de este documento la aplicación quedó pendiente, porque la sesión del CLI de Railway caducó y su renovación requiere iniciar sesión desde el navegador. No afecta al incremento ya construido: la migración no modifica ninguna columna existente, agrega tres y relaja la obligatoriedad del vínculo con el estudiante, y su carga inicial recalcula el carnet, el nombre y el texto de búsqueda de los registros que ya estaban cargados.</w:t>
+        <w:t xml:space="preserve">La migración del sprint se aplicó en el ambiente de Railway el 22 de octubre. No se pudo usar el túnel cifrado habitual porque la sesión de la herramienta de línea de comandos de Railway había caducado y su renovación coincidió con una caída de la plataforma, así que se aplicó conectando directamente a la base por su dirección pública, que se volvió a cerrar al terminar. La comprobación posterior confirmó que las tres columnas nuevas existen, que el vínculo con el estudiante quedó opcional, que ningún registro se quedó sin carnet ni sin nombre, que el texto de búsqueda coincide con el que calcula la aplicación y que los índices quedaron creados.</w:t>
       </w:r>
     </w:p>
     <w:p>
@@ -1970,7 +1970,7 @@
           <w:sz w:val="24"/>
           <w:szCs w:val="24"/>
         </w:rPr>
-        <w:t xml:space="preserve">Queda pendiente aplicar la migración del sprint en el ambiente de pruebas de Railway, por la razón explicada en la sección 8, y la carga de los registros históricos que AEUVG administra hoy en sus hojas, que corresponde al Sprint 5 junto con la importación desde Excel. Continúa también en gestión el trámite del dominio institucional iniciado en el Sprint 1.</w:t>
+        <w:t xml:space="preserve">Queda pendiente la carga de los registros históricos que AEUVG administra hoy en sus hojas de cálculo, que corresponde al Sprint 5 junto con la importación desde Excel. No bloquea el sprint: el módulo quedó funcionando y AEUVG ya puede registrar horas una por una desde el panel. Continúa también en gestión el trámite del dominio institucional iniciado en el Sprint 1.</w:t>
       </w:r>
     </w:p>
     <w:p>
@@ -5788,7 +5788,7 @@
                 <w:sz w:val="24"/>
                 <w:szCs w:val="24"/>
               </w:rPr>
-              <w:t xml:space="preserve">Actualización del registro de tiempos con el cierre completo, verificación de la migración pendiente y publicación de la versión final del sprint.</w:t>
+              <w:t xml:space="preserve">Aplicación de la migración del sprint en Railway y su comprobación contra la base, actualización del registro de tiempos y publicación de la versión final del sprint.</w:t>
             </w:r>
           </w:p>
         </w:tc>

</xml_diff>